<commit_message>
Deploy preview for PR 685 🛫
</commit_message>
<xml_diff>
--- a/pr-preview/pr-685/vignettes/articles/enteric_fever_example.docx
+++ b/pr-preview/pr-685/vignettes/articles/enteric_fever_example.docx
@@ -23,7 +23,7 @@
         <w:pStyle w:val="Date"/>
       </w:pPr>
       <w:r>
-        <w:t xml:space="preserve">2026-09-08</w:t>
+        <w:t xml:space="preserve">2026-09-09</w:t>
       </w:r>
     </w:p>
     <w:bookmarkStart w:id="11" w:name="introduction"/>
@@ -838,14 +838,23 @@
         <w:t xml:space="preserve"> </w:t>
       </w:r>
       <w:r>
-        <w:t xml:space="preserve">That is a coarser Monte Carlo approximation of</w:t>
+        <w:t xml:space="preserve">That is a coarser Monte Carlo approximation of the marginal</w:t>
+      </w:r>
+      <w:r>
+        <w:t xml:space="preserve"> </w:t>
+      </w:r>
+      <w:r>
+        <w:t xml:space="preserve">antibody-concentration density</w:t>
       </w:r>
       <w:r>
         <w:t xml:space="preserve"> </w:t>
       </w:r>
       <m:oMath>
         <m:r>
-          <m:t>ρ</m:t>
+          <m:rPr>
+            <m:sty m:val="p"/>
+          </m:rPr>
+          <m:t>p</m:t>
         </m:r>
         <m:r>
           <m:rPr>
@@ -3186,19 +3195,7 @@
         <w:t xml:space="preserve"> </w:t>
       </w:r>
       <w:r>
-        <w:t xml:space="preserve">is an earlier snapshot of this</w:t>
-      </w:r>
-      <w:r>
-        <w:t xml:space="preserve"> </w:t>
-      </w:r>
-      <w:r>
-        <w:t xml:space="preserve">object.</w:t>
-      </w:r>
-      <w:r>
-        <w:t xml:space="preserve"> </w:t>
-      </w:r>
-      <w:r>
-        <w:t xml:space="preserve">The two are identical except for</w:t>
+        <w:t xml:space="preserve">now carries the same values:</w:t>
       </w:r>
       <w:r>
         <w:t xml:space="preserve"> </w:t>
@@ -3207,16 +3204,13 @@
         <w:rPr>
           <w:rStyle w:val="VerbatimChar"/>
         </w:rPr>
-        <w:t xml:space="preserve">y.high</w:t>
-      </w:r>
-      <w:r>
-        <w:t xml:space="preserve">, the upper limit of quantification,</w:t>
-      </w:r>
-      <w:r>
-        <w:t xml:space="preserve"> </w:t>
-      </w:r>
-      <w:r>
-        <w:t xml:space="preserve">which reads</w:t>
+        <w:t xml:space="preserve">data-raw/example_noise_params_pk.R</w:t>
+      </w:r>
+      <w:r>
+        <w:t xml:space="preserve"> </w:t>
+      </w:r>
+      <w:r>
+        <w:t xml:space="preserve">builds it by downloading</w:t>
       </w:r>
       <w:r>
         <w:t xml:space="preserve"> </w:t>
@@ -3225,73 +3219,19 @@
         <w:rPr>
           <w:rStyle w:val="VerbatimChar"/>
         </w:rPr>
-        <w:t xml:space="preserve">1000</w:t>
-      </w:r>
-      <w:r>
-        <w:t xml:space="preserve"> </w:t>
-      </w:r>
-      <w:r>
-        <w:t xml:space="preserve">in the vendored snapshot and</w:t>
-      </w:r>
-      <w:r>
-        <w:t xml:space="preserve"> </w:t>
-      </w:r>
-      <w:r>
-        <w:rPr>
-          <w:rStyle w:val="VerbatimChar"/>
-        </w:rPr>
-        <w:t xml:space="preserve">5e+06</w:t>
-      </w:r>
-      <w:r>
-        <w:t xml:space="preserve"> </w:t>
-      </w:r>
-      <w:r>
-        <w:t xml:space="preserve">in the package data.</w:t>
-      </w:r>
-      <w:r>
-        <w:t xml:space="preserve"> </w:t>
-      </w:r>
-      <w:r>
-        <w:rPr>
-          <w:rStyle w:val="VerbatimChar"/>
-        </w:rPr>
-        <w:t xml:space="preserve">y.high</w:t>
-      </w:r>
-      <w:r>
-        <w:t xml:space="preserve"> </w:t>
-      </w:r>
-      <w:r>
-        <w:t xml:space="preserve">decides which observations are right-censored in the likelihood,</w:t>
-      </w:r>
-      <w:r>
-        <w:t xml:space="preserve"> </w:t>
-      </w:r>
-      <w:r>
-        <w:t xml:space="preserve">so the difference would matter if any observation reached either bound.</w:t>
-      </w:r>
-      <w:r>
-        <w:t xml:space="preserve"> </w:t>
-      </w:r>
-      <w:r>
-        <w:t xml:space="preserve">None does: the largest antibody concentration anywhere in this cross-sectional</w:t>
-      </w:r>
-      <w:r>
-        <w:t xml:space="preserve"> </w:t>
-      </w:r>
-      <w:r>
-        <w:t xml:space="preserve">dataset is about 219,</w:t>
-      </w:r>
-      <w:r>
-        <w:t xml:space="preserve"> </w:t>
-      </w:r>
-      <w:r>
-        <w:t xml:space="preserve">so no observation is right-censored under either value and the likelihood is</w:t>
-      </w:r>
-      <w:r>
-        <w:t xml:space="preserve"> </w:t>
-      </w:r>
-      <w:r>
-        <w:t xml:space="preserve">the same either way.</w:t>
+        <w:t xml:space="preserve">hqy4v</w:t>
+      </w:r>
+      <w:r>
+        <w:t xml:space="preserve"> </w:t>
+      </w:r>
+      <w:r>
+        <w:t xml:space="preserve">from OSF,</w:t>
+      </w:r>
+      <w:r>
+        <w:t xml:space="preserve"> </w:t>
+      </w:r>
+      <w:r>
+        <w:t xml:space="preserve">so either source gives the same noise model.</w:t>
       </w:r>
     </w:p>
     <w:bookmarkEnd w:id="34"/>

</xml_diff>